<commit_message>
Fix portrait page orientation for Sections 1-3 (CRITICAL)
Restored portrait sectPr at end of Section 3.1 that was lost during content
cuts. Without it, all of Sections 1, 2, and 3.1 inherited landscape page
settings from the next sectPr boundary (Section 3.2 Corporate Experience,
which is intentionally landscape in the original).

The fix adds a portrait 8.5x11 sectPr (1in margins) to the last paragraph
of Section 3.1 (Level of Effort body) so that:
- Sections 1, 2, 3.1 render in portrait 8.5x11 (standard letter)
- Section 3.2 remains landscape as in original
- Sections 4 onwards portrait as in original

https://claude.ai/code/session_012pqXiHtjbCHTtdnzTAGH2k
</commit_message>
<xml_diff>
--- a/Working File_CMS ERR_Volume I Technical Quote 4.28_Final.docx
+++ b/Working File_CMS ERR_Volume I Technical Quote 4.28_Final.docx
@@ -16038,6 +16038,16 @@
     <w:p>
       <w:pPr>
         <w:pStyle w:val="BodyText"/>
+        <w:sectPr>
+          <w:headerReference w:type="default" r:id="rId12"/>
+          <w:footerReference w:type="default" r:id="rId13"/>
+          <w:footerReference w:type="first" r:id="rId14"/>
+          <w:pgSz w:w="12240" w:h="15840" w:code="1"/>
+          <w:pgMar w:top="1440" w:right="1440" w:bottom="1440" w:left="1440" w:header="720" w:footer="720" w:gutter="0"/>
+          <w:cols w:space="720"/>
+          <w:vAlign w:val="bottom"/>
+          <w:docGrid w:linePitch="360"/>
+        </w:sectPr>
       </w:pPr>
       <w:r>
         <w:t>The labor mix supporting this task order spans seven labor categories: Program Manager, Senior Analyst, Analyst, IT Systems Specialist, Quality Assurance Specialist, Call Center Supervisor, and Case Processor. Total estimated staffing across the base period is approximately 45 FTEs, with planned surge capacity of up to 20 additional FTEs activated each January through May to support Form 1095-A tax season volume. A detailed labor-mix matrix will be provided at task order award upon finalization of performance work statement allocations.</w:t>

</xml_diff>

<commit_message>
Clean unnecessary spacing and formatting issues
Spacing cleanup (preserving all sectPr-bearing paragraphs):
- Collapsed 25 runs of consecutive empty paragraphs (one had 6 in a row)
- Removed 47 unnecessary empty/spacer paragraphs between text and headings
- Total: 62 empty paragraphs removed (~22 inches of vertical space)

Text cleanup:
- Stripped trailing whitespace from 80 paragraphs
- Fixed 9 runs with double spaces
- Replaced 17 instances of '--' with proper em-dash (—)

Verification:
- Field chars balanced: 39 begin / 39 separate / 39 end
- Section structure preserved: portrait Sections 1-3.1, landscape 3.2,
  portrait Section 4 onward (matches original)
- All sectPr-bearing paragraphs preserved

Page count estimate: 40.3 pages (word-based) → likely ~37-38 actual pages
after removing 62 empty paragraphs (~2.4 pages vertical space saved).
Standard 8.5x11 portrait, 1in margins, default font sizes/spacing.

https://claude.ai/code/session_012pqXiHtjbCHTtdnzTAGH2k
</commit_message>
<xml_diff>
--- a/Working File_CMS ERR_Volume I Technical Quote 4.28_Final.docx
+++ b/Working File_CMS ERR_Volume I Technical Quote 4.28_Final.docx
@@ -111,7 +111,7 @@
           <w:t>, Form 1095-A Data Reporting</w:t>
         </w:r>
         <w:r>
-          <w:t xml:space="preserve"> </w:t>
+          <w:t xml:space="preserve"/>
         </w:r>
       </w:fldSimple>
     </w:p>
@@ -253,11 +253,6 @@
       <w:pPr>
         <w:pStyle w:val="Cover2Agency"/>
       </w:pPr>
-    </w:p>
-    <w:p>
-      <w:pPr>
-        <w:pStyle w:val="Cover2Agency"/>
-      </w:pPr>
       <w:fldSimple w:instr="STYLEREF  &quot;Cover title&quot;  \* MERGEFORMAT">
         <w:r>
           <w:rPr>
@@ -323,11 +318,6 @@
     </w:p>
     <w:p>
       <w:pPr>
-        <w:pStyle w:val="Cover2Presentedby"/>
-      </w:pPr>
-    </w:p>
-    <w:p>
-      <w:pPr>
         <w:pStyle w:val="Cover2DeloitteAddress"/>
       </w:pPr>
       <w:r>
@@ -363,11 +353,6 @@
       <w:r>
         <w:t>, 1919 North Lynn Street, Arlington, VA 22209</w:t>
       </w:r>
-    </w:p>
-    <w:p>
-      <w:pPr>
-        <w:pStyle w:val="Cover2Date"/>
-      </w:pPr>
     </w:p>
     <w:p>
       <w:pPr>
@@ -525,11 +510,6 @@
     </w:tbl>
     <w:p>
       <w:pPr>
-        <w:pStyle w:val="ParagraphSpacer"/>
-      </w:pPr>
-    </w:p>
-    <w:p>
-      <w:pPr>
         <w:pStyle w:val="Cover2Presentedby"/>
       </w:pPr>
       <w:r>
@@ -689,11 +669,6 @@
         </w:tc>
       </w:tr>
     </w:tbl>
-    <w:p>
-      <w:pPr>
-        <w:pStyle w:val="Cover2DeloitteAddress"/>
-      </w:pPr>
-    </w:p>
     <w:tbl>
       <w:tblPr>
         <w:tblpPr w:leftFromText="187" w:rightFromText="187" w:vertAnchor="page" w:horzAnchor="margin" w:tblpY="13051"/>
@@ -746,11 +721,6 @@
         </w:tc>
       </w:tr>
     </w:tbl>
-    <w:p>
-      <w:pPr>
-        <w:pStyle w:val="BodyText"/>
-      </w:pPr>
-    </w:p>
     <w:p>
       <w:pPr>
         <w:pStyle w:val="Letterdate"/>
@@ -1185,16 +1155,6 @@
     <w:p>
       <w:pPr>
         <w:pStyle w:val="Lettertext"/>
-      </w:pPr>
-    </w:p>
-    <w:p>
-      <w:pPr>
-        <w:pStyle w:val="Lettertext"/>
-      </w:pPr>
-    </w:p>
-    <w:p>
-      <w:pPr>
-        <w:pStyle w:val="Lettertext"/>
         <w:rPr>
           <w:noProof/>
         </w:rPr>
@@ -1210,7 +1170,7 @@
           <w:rPr>
             <w:noProof/>
           </w:rPr>
-          <w:t xml:space="preserve"> </w:t>
+          <w:t xml:space="preserve"/>
         </w:r>
       </w:fldSimple>
     </w:p>
@@ -4736,7 +4696,7 @@
               <w:rPr>
                 <w:bCs/>
               </w:rPr>
-              <w:t xml:space="preserve">Protect against fraud, waste, and abuse </w:t>
+              <w:t xml:space="preserve">Protect against fraud, waste, and abuse</w:t>
             </w:r>
           </w:p>
         </w:tc>
@@ -4917,7 +4877,7 @@
       </w:r>
       <w:proofErr w:type="gramEnd"/>
       <w:r>
-        <w:t xml:space="preserve">. Deloitte applies structured assessment and optimization -- improving rule performance, refining staffing models, and strengthening program intelligence -- with CMS visibility and approval at each step. </w:t>
+        <w:t xml:space="preserve">. Deloitte applies structured assessment and optimization—improving rule performance, refining staffing models, and strengthening program intelligence—with CMS visibility and approval at each step.</w:t>
       </w:r>
     </w:p>
     <w:p>
@@ -4936,7 +4896,7 @@
         <w:t xml:space="preserve">Program integrity is not a compliance layer in this operating model. It is a design principle embedded in every task from Day 1. </w:t>
       </w:r>
       <w:r>
-        <w:t>Audit-ready case documentation, documented approval before any override or batch correction, elevated QA sampling for high-risk case types, and a cross-task integrity risk register established during transition-in are operational standards, not periodic reviews. Deloitte will surface integrity findings to CMS with root cause analysis and recommended corrective action -- not after an audit, but as a routine output of the operating model.</w:t>
+        <w:t>Audit-ready case documentation, documented approval before any override or batch correction, elevated QA sampling for high-risk case types, and a cross-task integrity risk register established during transition-in are operational standards, not periodic reviews. Deloitte will surface integrity findings to CMS with root cause analysis and recommended corrective action—not after an audit, but as a routine output of the operating model.</w:t>
       </w:r>
     </w:p>
     <w:p>
@@ -4982,7 +4942,7 @@
         <w:t xml:space="preserve">operational approach </w:t>
       </w:r>
       <w:r>
-        <w:t>makes those connections visible in real time -- one coordinated response, one CMS briefing.</w:t>
+        <w:t>makes those connections visible in real time—one coordinated response, one CMS briefing.</w:t>
       </w:r>
     </w:p>
     <w:p>
@@ -4990,7 +4950,7 @@
         <w:pStyle w:val="BodyText"/>
       </w:pPr>
       <w:r>
-        <w:t xml:space="preserve">Deloitte will be operationally ready before the first case transfers. The transition-in approach -- detailed under Task 12 -- validates every system, workflow, and intake pipeline against live production behavior. Deloitte deploys </w:t>
+        <w:t xml:space="preserve">Deloitte will be operationally ready before the first case transfers. The transition-in approach—detailed under Task 12—validates every system, workflow, and intake pipeline against live production behavior. Deloitte deploys </w:t>
       </w:r>
       <w:proofErr w:type="spellStart"/>
       <w:r>
@@ -4998,7 +4958,7 @@
       </w:r>
       <w:proofErr w:type="spellEnd"/>
       <w:r>
-        <w:t xml:space="preserve">, our proprietary GenAI platform, to independently capture rule logic, routing rules, and classification behavior directly from source code across all tasks simultaneously -- producing a system understanding that </w:t>
+        <w:t xml:space="preserve">, our proprietary GenAI platform, to independently capture rule logic, routing rules, and classification behavior directly from source code across all tasks simultaneously—producing a system understanding that </w:t>
       </w:r>
       <w:r>
         <w:t>supplements what is shared through SOPs and KT</w:t>
@@ -5081,7 +5041,7 @@
       </w:r>
       <w:proofErr w:type="gramEnd"/>
       <w:r>
-        <w:t xml:space="preserve"> handles a live case. From Day 1, a weekly cross-task data share connects all three teams so patterns that originate in one workstream and surface in another are coordinated as a single corrective action -- not discovered independently weeks apart.</w:t>
+        <w:t xml:space="preserve"> handles a live case. From Day 1, a weekly cross-task data share connects all three teams so patterns that originate in one workstream and surface in another are coordinated as a single corrective action—not discovered independently weeks apart.</w:t>
       </w:r>
     </w:p>
     <w:p>
@@ -5215,7 +5175,7 @@
             </w:r>
             <w:proofErr w:type="spellEnd"/>
             <w:r>
-              <w:t xml:space="preserve"> captures the same knowledge from the source code in weeks, independently, across all three tasks simultaneously. Deloitte arrives at contract start with a system understanding that the incumbent took years to accumulate -- and a daily transition cadence that makes readiness visible and measurable rather than assumed.</w:t>
+              <w:t xml:space="preserve"> captures the same knowledge from the source code in weeks, independently, across all three tasks simultaneously. Deloitte arrives at contract start with a system understanding that the incumbent took years to accumulate—and a daily transition cadence that makes readiness visible and measurable rather than assumed.</w:t>
             </w:r>
           </w:p>
         </w:tc>
@@ -5250,7 +5210,7 @@
         </w:rPr>
       </w:pPr>
       <w:r>
-        <w:t xml:space="preserve">What makes this workstream hard to run well is the simultaneous demand for automation at scale and judgment in complexity. The approximately four million low-complexity disputes processed annually require a rule library that is accurate, well-maintained, and monitored at the dispute-type level -- not in aggregate. The high-complexity workload, including UIRs, PDI disputes, and cases requiring manual enrollment reconstruction, demands caseworker judgment that is consistent, documented, and auditable. </w:t>
+        <w:t xml:space="preserve">What makes this workstream hard to run well is the simultaneous demand for automation at scale and judgment in complexity. The approximately four million low-complexity disputes processed annually require a rule library that is accurate, well-maintained, and monitored at the dispute-type level—not in aggregate. The high-complexity workload, including UIRs, PDI disputes, and cases requiring manual enrollment reconstruction, demands caseworker judgment that is consistent, documented, and auditable. </w:t>
       </w:r>
       <w:r>
         <w:rPr>
@@ -5263,7 +5223,7 @@
           <w:iCs/>
         </w:rPr>
         <w:lastRenderedPageBreak/>
-        <w:t>programs -- [insert relevant proof point program names here]. Our California SBE Maintenance and Operations takeover in 2019 is a direct precedent: Deloitte inherited a live operational system, validated production behavior independently of prior contractor documentation, and improved performance without disrupting the ongoing operation.</w:t>
+        <w:t>programs—[insert relevant proof point program names here]. Our California SBE Maintenance and Operations takeover in 2019 is a direct precedent: Deloitte inherited a live operational system, validated production behavior independently of prior contractor documentation, and improved performance without disrupting the ongoing operation.</w:t>
       </w:r>
     </w:p>
     <w:p>
@@ -5367,11 +5327,6 @@
         <w:lastRenderedPageBreak/>
         <w:t>handle — each drives a different corrective action. The dispute analytics deliverable serves as both a CMS reporting output and Deloitte’s internal rule development agenda, made visible to CMS.</w:t>
       </w:r>
-    </w:p>
-    <w:p>
-      <w:pPr>
-        <w:spacing w:after="80"/>
-      </w:pPr>
     </w:p>
     <w:p>
       <w:r>
@@ -5420,11 +5375,6 @@
     </w:p>
     <w:p>
       <w:pPr>
-        <w:spacing w:after="80"/>
-      </w:pPr>
-    </w:p>
-    <w:p>
-      <w:pPr>
         <w:pStyle w:val="BodyText"/>
       </w:pPr>
       <w:r>
@@ -5700,11 +5650,6 @@
       <w:pPr>
         <w:pStyle w:val="BodyText"/>
       </w:pPr>
-    </w:p>
-    <w:p>
-      <w:pPr>
-        <w:pStyle w:val="BodyText"/>
-      </w:pPr>
       <w:r>
         <w:rPr>
           <w:b/>
@@ -5792,14 +5737,14 @@
               <w:rPr>
                 <w:szCs w:val="20"/>
               </w:rPr>
-              <w:t>complexity  |</w:t>
+              <w:t>complexity |</w:t>
             </w:r>
             <w:proofErr w:type="gramEnd"/>
             <w:r>
               <w:rPr>
                 <w:szCs w:val="20"/>
               </w:rPr>
-              <w:t xml:space="preserve">  2-day SLA   </w:t>
+              <w:t xml:space="preserve"> 2-day SLA</w:t>
             </w:r>
           </w:p>
         </w:tc>
@@ -5838,14 +5783,14 @@
               <w:rPr>
                 <w:szCs w:val="20"/>
               </w:rPr>
-              <w:t>complexity  |</w:t>
+              <w:t>complexity |</w:t>
             </w:r>
             <w:proofErr w:type="gramEnd"/>
             <w:r>
               <w:rPr>
                 <w:szCs w:val="20"/>
               </w:rPr>
-              <w:t xml:space="preserve">  5-day SLA  </w:t>
+              <w:t xml:space="preserve"> 5-day SLA</w:t>
             </w:r>
           </w:p>
         </w:tc>
@@ -5884,14 +5829,14 @@
               <w:rPr>
                 <w:szCs w:val="20"/>
               </w:rPr>
-              <w:t>complexity  |</w:t>
+              <w:t>complexity |</w:t>
             </w:r>
             <w:proofErr w:type="gramEnd"/>
             <w:r>
               <w:rPr>
                 <w:szCs w:val="20"/>
               </w:rPr>
-              <w:t xml:space="preserve">  10-day SLA  </w:t>
+              <w:t xml:space="preserve"> 10-day SLA</w:t>
             </w:r>
           </w:p>
         </w:tc>
@@ -6360,36 +6305,6 @@
     </w:p>
     <w:p>
       <w:pPr>
-        <w:pStyle w:val="BodyText"/>
-      </w:pPr>
-    </w:p>
-    <w:p>
-      <w:pPr>
-        <w:pStyle w:val="BodyText"/>
-      </w:pPr>
-    </w:p>
-    <w:p>
-      <w:pPr>
-        <w:pStyle w:val="BodyText"/>
-      </w:pPr>
-    </w:p>
-    <w:p>
-      <w:pPr>
-        <w:pStyle w:val="BodyText"/>
-      </w:pPr>
-    </w:p>
-    <w:p>
-      <w:pPr>
-        <w:pStyle w:val="BodyText"/>
-      </w:pPr>
-    </w:p>
-    <w:p>
-      <w:pPr>
-        <w:pStyle w:val="BodyText"/>
-      </w:pPr>
-    </w:p>
-    <w:p>
-      <w:pPr>
         <w:pStyle w:val="TableTitle"/>
       </w:pPr>
       <w:r>
@@ -6907,7 +6822,7 @@
         <w:pStyle w:val="BodyText"/>
       </w:pPr>
       <w:r>
-        <w:t>Consumers referred to the CCHC have already contacted the Call Center, engaged with an issuer or assister, and still could not resolve their coverage situation through standard channels. The cases that arrive here - DMIs, delayed enrollments, retroactive terminations, APTC discrepancies -- sit at the intersection of policy complexity, multi-system data conflicts, and human circumstances that standard processes were not designed to handle. For these consumers, coverage uncertainty is not a data problem. It is a barrier to care and a source of financial stress.</w:t>
+        <w:t>Consumers referred to the CCHC have already contacted the Call Center, engaged with an issuer or assister, and still could not resolve their coverage situation through standard channels. The cases that arrive here - DMIs, delayed enrollments, retroactive terminations, APTC discrepancies—sit at the intersection of policy complexity, multi-system data conflicts, and human circumstances that standard processes were not designed to handle. For these consumers, coverage uncertainty is not a data problem. It is a barrier to care and a source of financial stress.</w:t>
       </w:r>
     </w:p>
     <w:p>
@@ -6923,7 +6838,7 @@
       </w:r>
       <w:proofErr w:type="gramEnd"/>
       <w:r>
-        <w:t xml:space="preserve"> and an escalation discipline that surfaces the right issues to CMS before they become visible problems. CCHC is the only workstream in this contract where the human cost of a process failure is visible in real time.  </w:t>
+        <w:t xml:space="preserve"> and an escalation discipline that surfaces the right issues to CMS before they become visible problems. CCHC is the only workstream in this contract where the human cost of a process failure is visible in real time.</w:t>
       </w:r>
     </w:p>
     <w:p>
@@ -7081,7 +6996,7 @@
       </w:r>
       <w:proofErr w:type="gramEnd"/>
       <w:r>
-        <w:t xml:space="preserve"> it. A retroactive termination case referred from the Exchange Call Center will receive the same classification logic, research path, and documentation standard as one referred from OPOLE or CMS leadership. This consistency is what makes QA sampling meaningful: when every caseworker follows the same protocol, deviations are detectable and correctable rather than buried in channel-specific variation. </w:t>
+        <w:t xml:space="preserve"> it. A retroactive termination case referred from the Exchange Call Center will receive the same classification logic, research path, and documentation standard as one referred from OPOLE or CMS leadership. This consistency is what makes QA sampling meaningful: when every caseworker follows the same protocol, deviations are detectable and correctable rather than buried in channel-specific variation.</w:t>
       </w:r>
     </w:p>
     <w:p>
@@ -7254,7 +7169,7 @@
             </w:r>
             <w:proofErr w:type="gramEnd"/>
             <w:r>
-              <w:t xml:space="preserve"> through a defined research sequence across MCR, TM, MCU, MIDAS, HICS, and SEED. Anomalies will be flagged in the workflow as they arise. Documentation will be captured in real time, not reconstructed at closure, and all communications with issuers and consumers -- including content, channel, and outcome -- will be recorded as they occur, ensuring a complete and auditable case record.</w:t>
+              <w:t xml:space="preserve"> through a defined research sequence across MCR, TM, MCU, MIDAS, HICS, and SEED. Anomalies will be flagged in the workflow as they arise. Documentation will be captured in real time, not reconstructed at closure, and all communications with issuers and consumers—including content, channel, and outcome—will be recorded as they occur, ensuring a complete and auditable case record.</w:t>
             </w:r>
           </w:p>
         </w:tc>
@@ -7290,7 +7205,7 @@
             </w:r>
             <w:proofErr w:type="gramStart"/>
             <w:r>
-              <w:t>reviewed  for</w:t>
+              <w:t>reviewed for</w:t>
             </w:r>
             <w:proofErr w:type="gramEnd"/>
             <w:r>
@@ -7343,7 +7258,7 @@
       </w:pPr>
       <w:r>
         <w:lastRenderedPageBreak/>
-        <w:t xml:space="preserve">Capacity management </w:t>
+        <w:t xml:space="preserve">Capacity management</w:t>
       </w:r>
     </w:p>
     <w:p>
@@ -7431,7 +7346,7 @@
               <w:spacing w:after="0"/>
             </w:pPr>
             <w:r>
-              <w:t>Transition risk: CCHC operations rely on informal decision logic that SOPs do not capture -- gaps emerge only after go-live if not captured during transition</w:t>
+              <w:t>Transition risk: CCHC operations rely on informal decision logic that SOPs do not capture—gaps emerge only after go-live if not captured during transition</w:t>
             </w:r>
           </w:p>
         </w:tc>
@@ -7702,7 +7617,7 @@
       </w:r>
       <w:proofErr w:type="gramEnd"/>
       <w:r>
-        <w:t xml:space="preserve"> effect. A case closed correctly in CERRS but submitted to the FFE with a sequencing error or a missed pre-validation has not been resolved -- it has created a new data problem that will surface as a downstream dispute or an incorrect 1095-A. Deloitte treats this workstream as a precision execution function: every submission type (standard BUU, non-standard BUU, Hard Case, Update Policy API) governed by the same cycle discipline, every action logged from compilation through confirmed FFE update, and CMS notified of any exception before it becomes a rework cycle.</w:t>
+        <w:t xml:space="preserve"> effect. A case closed correctly in CERRS but submitted to the FFE with a sequencing error or a missed pre-validation has not been resolved—it has created a new data problem that will surface as a downstream dispute or an incorrect 1095-A. Deloitte treats this workstream as a precision execution function: every submission type (standard BUU, non-standard BUU, Hard Case, Update Policy API) governed by the same cycle discipline, every action logged from compilation through confirmed FFE update, and CMS notified of any exception before it becomes a rework cycle.</w:t>
       </w:r>
     </w:p>
     <w:p>
@@ -7718,7 +7633,7 @@
         <w:pStyle w:val="BodyText"/>
       </w:pPr>
       <w:r>
-        <w:t xml:space="preserve">Deloitte will be operationally ready before the first submission window opens. During transition-in, the pipeline is validated end-to-end against live system behavior -- compilation logic, pre-validation rules, OA Contractor interface, and QA Team handoff -- so there are no surprises in the first correction cycle. Prior-year submission history is reviewed to surface informal compensating controls that are not in current SOPs, </w:t>
+        <w:t xml:space="preserve">Deloitte will be operationally ready before the first submission window opens. During transition-in, the pipeline is validated end-to-end against live system behavior—compilation logic, pre-validation rules, OA Contractor interface, and QA Team handoff—so there are no surprises in the first correction cycle. Prior-year submission history is reviewed to surface informal compensating controls that are not in current SOPs, </w:t>
       </w:r>
       <w:r>
         <w:lastRenderedPageBreak/>
@@ -7842,7 +7757,7 @@
               <w:cnfStyle w:val="000000000000" w:firstRow="0" w:lastRow="0" w:firstColumn="0" w:lastColumn="0" w:oddVBand="0" w:evenVBand="0" w:oddHBand="0" w:evenHBand="0" w:firstRowFirstColumn="0" w:firstRowLastColumn="0" w:lastRowFirstColumn="0" w:lastRowLastColumn="0"/>
             </w:pPr>
             <w:r>
-              <w:t>Cycle-level status dashboard: compiled, validated, submitted, confirmed -- updated after each stage</w:t>
+              <w:t>Cycle-level status dashboard: compiled, validated, submitted, confirmed—updated after each stage</w:t>
             </w:r>
           </w:p>
         </w:tc>
@@ -8118,7 +8033,7 @@
         <w:pStyle w:val="BodyText"/>
       </w:pPr>
       <w:r>
-        <w:t>Transition-in establishes the baseline: full notice library inventory, translation status by notice and language, current print vendor specifications, and EFT and DSRS configuration -- validated against live system behavior before the first notice file is generated.</w:t>
+        <w:t>Transition-in establishes the baseline: full notice library inventory, translation status by notice and language, current print vendor specifications, and EFT and DSRS configuration—validated against live system behavior before the first notice file is generated.</w:t>
       </w:r>
     </w:p>
     <w:p>
@@ -8134,7 +8049,7 @@
       </w:r>
       <w:proofErr w:type="gramEnd"/>
       <w:r>
-        <w:t xml:space="preserve"> EFT confirmation. No batch closes without a confirmed DSRS upload. Every content change triggers a translation review before the updated notice enters production. CMS sees pipeline status through a standing notice generation report covering volume, timing, translation status, and any exceptions -- no surprises, no quiet resolutions.</w:t>
+        <w:t xml:space="preserve"> EFT confirmation. No batch closes without a confirmed DSRS upload. Every content change triggers a translation review before the updated notice enters production. CMS sees pipeline status through a standing notice generation report covering volume, timing, translation status, and any exceptions—no surprises, no quiet resolutions.</w:t>
       </w:r>
     </w:p>
     <w:p>
@@ -8148,21 +8063,11 @@
     </w:p>
     <w:p>
       <w:pPr>
-        <w:pStyle w:val="ParagraphSpacer"/>
-      </w:pPr>
-    </w:p>
-    <w:p>
-      <w:pPr>
         <w:pStyle w:val="TableTitle"/>
       </w:pPr>
       <w:r>
         <w:t>Table 1.2.5-2. Task 6 Challenges and Mitigations.</w:t>
       </w:r>
-    </w:p>
-    <w:p>
-      <w:pPr>
-        <w:pStyle w:val="ParagraphSpacer"/>
-      </w:pPr>
     </w:p>
     <w:p>
       <w:pPr>
@@ -8676,11 +8581,6 @@
     </w:p>
     <w:p>
       <w:pPr>
-        <w:pStyle w:val="ParagraphSpacer"/>
-      </w:pPr>
-    </w:p>
-    <w:p>
-      <w:pPr>
         <w:pStyle w:val="BodyText"/>
       </w:pPr>
       <w:r>
@@ -8813,11 +8713,6 @@
     </w:p>
     <w:p>
       <w:pPr>
-        <w:pStyle w:val="ParagraphSpacer"/>
-      </w:pPr>
-    </w:p>
-    <w:p>
-      <w:pPr>
         <w:pStyle w:val="BodyText"/>
       </w:pPr>
       <w:r>
@@ -9706,11 +9601,6 @@
         </w:tc>
       </w:tr>
     </w:tbl>
-    <w:p>
-      <w:pPr>
-        <w:pStyle w:val="ParagraphSpacer"/>
-      </w:pPr>
-    </w:p>
     <w:p>
       <w:pPr>
         <w:pStyle w:val="ParagraphSpacer"/>
@@ -9998,7 +9888,7 @@
               <w:pStyle w:val="TableHeading"/>
             </w:pPr>
             <w:r>
-              <w:t xml:space="preserve">Deliverable </w:t>
+              <w:t xml:space="preserve">Deliverable</w:t>
             </w:r>
           </w:p>
         </w:tc>
@@ -10071,7 +9961,7 @@
               <w:cnfStyle w:val="000000000000" w:firstRow="0" w:lastRow="0" w:firstColumn="0" w:lastColumn="0" w:oddVBand="0" w:evenVBand="0" w:oddHBand="0" w:evenHBand="0" w:firstRowFirstColumn="0" w:firstRowLastColumn="0" w:lastRowFirstColumn="0" w:lastRowLastColumn="0"/>
             </w:pPr>
             <w:r>
-              <w:t xml:space="preserve">On Time: Virtual meeting with COR, BO, Business Operations Team, Program Management Team and Incumbent Contractor </w:t>
+              <w:t xml:space="preserve">On Time: Virtual meeting with COR, BO, Business Operations Team, Program Management Team and Incumbent Contractor</w:t>
             </w:r>
           </w:p>
         </w:tc>
@@ -10095,7 +9985,7 @@
                 <w:rStyle w:val="eop"/>
               </w:rPr>
               <w:tab/>
-              <w:t xml:space="preserve">Review current ER&amp;R QASP to identify any missed AQLs, SLAs, or KPIs. Locate relevant lessons learned and RAID log entries to discuss history. </w:t>
+              <w:t xml:space="preserve">Review current ER&amp;R QASP to identify any missed AQLs, SLAs, or KPIs. Locate relevant lessons learned and RAID log entries to discuss history.</w:t>
             </w:r>
           </w:p>
         </w:tc>
@@ -10120,7 +10010,7 @@
               <w:cnfStyle w:val="000000000000" w:firstRow="0" w:lastRow="0" w:firstColumn="0" w:lastColumn="0" w:oddVBand="0" w:evenVBand="0" w:oddHBand="0" w:evenHBand="0" w:firstRowFirstColumn="0" w:firstRowLastColumn="0" w:lastRowFirstColumn="0" w:lastRowLastColumn="0"/>
             </w:pPr>
             <w:r>
-              <w:t xml:space="preserve">MS Teams </w:t>
+              <w:t xml:space="preserve">MS Teams</w:t>
             </w:r>
           </w:p>
           <w:p>
@@ -10130,7 +10020,7 @@
               <w:cnfStyle w:val="000000000000" w:firstRow="0" w:lastRow="0" w:firstColumn="0" w:lastColumn="0" w:oddVBand="0" w:evenVBand="0" w:oddHBand="0" w:evenHBand="0" w:firstRowFirstColumn="0" w:firstRowLastColumn="0" w:lastRowFirstColumn="0" w:lastRowLastColumn="0"/>
             </w:pPr>
             <w:r>
-              <w:t xml:space="preserve">MS Co Pilot </w:t>
+              <w:t xml:space="preserve">MS Co Pilot</w:t>
             </w:r>
           </w:p>
           <w:p>
@@ -10195,7 +10085,7 @@
                 <w:rStyle w:val="eop"/>
               </w:rPr>
               <w:lastRenderedPageBreak/>
-              <w:t xml:space="preserve">updates to the COR and request approval  </w:t>
+              <w:t xml:space="preserve">updates to the COR and request approval</w:t>
             </w:r>
           </w:p>
         </w:tc>
@@ -10221,7 +10111,7 @@
               <w:cnfStyle w:val="000000000000" w:firstRow="0" w:lastRow="0" w:firstColumn="0" w:lastColumn="0" w:oddVBand="0" w:evenVBand="0" w:oddHBand="0" w:evenHBand="0" w:firstRowFirstColumn="0" w:firstRowLastColumn="0" w:lastRowFirstColumn="0" w:lastRowLastColumn="0"/>
             </w:pPr>
             <w:r>
-              <w:t xml:space="preserve">MS Teams </w:t>
+              <w:t xml:space="preserve">MS Teams</w:t>
             </w:r>
           </w:p>
           <w:p>
@@ -10231,7 +10121,7 @@
               <w:cnfStyle w:val="000000000000" w:firstRow="0" w:lastRow="0" w:firstColumn="0" w:lastColumn="0" w:oddVBand="0" w:evenVBand="0" w:oddHBand="0" w:evenHBand="0" w:firstRowFirstColumn="0" w:firstRowLastColumn="0" w:lastRowFirstColumn="0" w:lastRowLastColumn="0"/>
             </w:pPr>
             <w:r>
-              <w:t xml:space="preserve">MS Co Pilot </w:t>
+              <w:t xml:space="preserve">MS Co Pilot</w:t>
             </w:r>
           </w:p>
         </w:tc>
@@ -10259,7 +10149,7 @@
               <w:cnfStyle w:val="000000000000" w:firstRow="0" w:lastRow="0" w:firstColumn="0" w:lastColumn="0" w:oddVBand="0" w:evenVBand="0" w:oddHBand="0" w:evenHBand="0" w:firstRowFirstColumn="0" w:firstRowLastColumn="0" w:lastRowFirstColumn="0" w:lastRowLastColumn="0"/>
             </w:pPr>
             <w:r>
-              <w:t xml:space="preserve">Quarterly: Publication to CMS intranet </w:t>
+              <w:t xml:space="preserve">Quarterly: Publication to CMS intranet</w:t>
             </w:r>
           </w:p>
         </w:tc>
@@ -10308,7 +10198,7 @@
               <w:cnfStyle w:val="000000000000" w:firstRow="0" w:lastRow="0" w:firstColumn="0" w:lastColumn="0" w:oddVBand="0" w:evenVBand="0" w:oddHBand="0" w:evenHBand="0" w:firstRowFirstColumn="0" w:firstRowLastColumn="0" w:lastRowFirstColumn="0" w:lastRowLastColumn="0"/>
             </w:pPr>
             <w:r>
-              <w:t xml:space="preserve">MS Teams </w:t>
+              <w:t xml:space="preserve">MS Teams</w:t>
             </w:r>
           </w:p>
           <w:p>
@@ -10318,7 +10208,7 @@
               <w:cnfStyle w:val="000000000000" w:firstRow="0" w:lastRow="0" w:firstColumn="0" w:lastColumn="0" w:oddVBand="0" w:evenVBand="0" w:oddHBand="0" w:evenHBand="0" w:firstRowFirstColumn="0" w:firstRowLastColumn="0" w:lastRowFirstColumn="0" w:lastRowLastColumn="0"/>
             </w:pPr>
             <w:r>
-              <w:t xml:space="preserve">MS Co Pilot </w:t>
+              <w:t xml:space="preserve">MS Co Pilot</w:t>
             </w:r>
           </w:p>
         </w:tc>
@@ -10388,7 +10278,7 @@
               <w:cnfStyle w:val="000000000000" w:firstRow="0" w:lastRow="0" w:firstColumn="0" w:lastColumn="0" w:oddVBand="0" w:evenVBand="0" w:oddHBand="0" w:evenHBand="0" w:firstRowFirstColumn="0" w:firstRowLastColumn="0" w:lastRowFirstColumn="0" w:lastRowLastColumn="0"/>
             </w:pPr>
             <w:r>
-              <w:t xml:space="preserve">MS Teams </w:t>
+              <w:t xml:space="preserve">MS Teams</w:t>
             </w:r>
           </w:p>
           <w:p>
@@ -10408,7 +10298,7 @@
               <w:cnfStyle w:val="000000000000" w:firstRow="0" w:lastRow="0" w:firstColumn="0" w:lastColumn="0" w:oddVBand="0" w:evenVBand="0" w:oddHBand="0" w:evenHBand="0" w:firstRowFirstColumn="0" w:firstRowLastColumn="0" w:lastRowFirstColumn="0" w:lastRowLastColumn="0"/>
             </w:pPr>
             <w:r>
-              <w:t xml:space="preserve">MS Co Pilot </w:t>
+              <w:t xml:space="preserve">MS Co Pilot</w:t>
             </w:r>
           </w:p>
           <w:p>
@@ -10470,7 +10360,7 @@
                 <w:rStyle w:val="eop"/>
               </w:rPr>
               <w:tab/>
-              <w:t xml:space="preserve">Request feedback on SOP design, recent policy change, or suggestions based on experience </w:t>
+              <w:t xml:space="preserve">Request feedback on SOP design, recent policy change, or suggestions based on experience</w:t>
             </w:r>
           </w:p>
         </w:tc>
@@ -10485,7 +10375,7 @@
               <w:cnfStyle w:val="000000000000" w:firstRow="0" w:lastRow="0" w:firstColumn="0" w:lastColumn="0" w:oddVBand="0" w:evenVBand="0" w:oddHBand="0" w:evenHBand="0" w:firstRowFirstColumn="0" w:firstRowLastColumn="0" w:lastRowFirstColumn="0" w:lastRowLastColumn="0"/>
             </w:pPr>
             <w:r>
-              <w:t xml:space="preserve">MS Teams </w:t>
+              <w:t xml:space="preserve">MS Teams</w:t>
             </w:r>
           </w:p>
           <w:p>
@@ -10557,7 +10447,7 @@
                 <w:rStyle w:val="eop"/>
               </w:rPr>
               <w:tab/>
-              <w:t xml:space="preserve">Summarize design feedback and present recommended updates </w:t>
+              <w:t xml:space="preserve">Summarize design feedback and present recommended updates</w:t>
             </w:r>
           </w:p>
         </w:tc>
@@ -10572,7 +10462,7 @@
               <w:cnfStyle w:val="000000000000" w:firstRow="0" w:lastRow="0" w:firstColumn="0" w:lastColumn="0" w:oddVBand="0" w:evenVBand="0" w:oddHBand="0" w:evenHBand="0" w:firstRowFirstColumn="0" w:firstRowLastColumn="0" w:lastRowFirstColumn="0" w:lastRowLastColumn="0"/>
             </w:pPr>
             <w:r>
-              <w:t xml:space="preserve">MS Teams </w:t>
+              <w:t xml:space="preserve">MS Teams</w:t>
             </w:r>
           </w:p>
           <w:p>
@@ -10654,7 +10544,7 @@
                 <w:rStyle w:val="eop"/>
               </w:rPr>
               <w:tab/>
-              <w:t xml:space="preserve">Submit proposed updates to the COR and request approval  </w:t>
+              <w:t xml:space="preserve">Submit proposed updates to the COR and request approval</w:t>
             </w:r>
           </w:p>
         </w:tc>
@@ -10689,7 +10579,7 @@
               <w:cnfStyle w:val="000000000000" w:firstRow="0" w:lastRow="0" w:firstColumn="0" w:lastColumn="0" w:oddVBand="0" w:evenVBand="0" w:oddHBand="0" w:evenHBand="0" w:firstRowFirstColumn="0" w:firstRowLastColumn="0" w:lastRowFirstColumn="0" w:lastRowLastColumn="0"/>
             </w:pPr>
             <w:r>
-              <w:t xml:space="preserve">CMS SharePoint </w:t>
+              <w:t xml:space="preserve">CMS SharePoint</w:t>
             </w:r>
           </w:p>
           <w:p>
@@ -10699,7 +10589,7 @@
               <w:cnfStyle w:val="000000000000" w:firstRow="0" w:lastRow="0" w:firstColumn="0" w:lastColumn="0" w:oddVBand="0" w:evenVBand="0" w:oddHBand="0" w:evenHBand="0" w:firstRowFirstColumn="0" w:firstRowLastColumn="0" w:lastRowFirstColumn="0" w:lastRowLastColumn="0"/>
             </w:pPr>
             <w:r>
-              <w:t xml:space="preserve">CMS Slack </w:t>
+              <w:t xml:space="preserve">CMS Slack</w:t>
             </w:r>
           </w:p>
           <w:p>
@@ -10829,11 +10719,6 @@
         </w:tc>
       </w:tr>
     </w:tbl>
-    <w:p>
-      <w:pPr>
-        <w:pStyle w:val="ParagraphSpacer"/>
-      </w:pPr>
-    </w:p>
     <w:p>
       <w:pPr>
         <w:pStyle w:val="BodyText"/>
@@ -10877,7 +10762,7 @@
               <w:pStyle w:val="TableHeading"/>
             </w:pPr>
             <w:r>
-              <w:t xml:space="preserve">Deliverable </w:t>
+              <w:t xml:space="preserve">Deliverable</w:t>
             </w:r>
           </w:p>
         </w:tc>
@@ -10974,7 +10859,7 @@
                 <w:rStyle w:val="eop"/>
               </w:rPr>
               <w:tab/>
-              <w:t xml:space="preserve">Identify, record, and review user groups for each report </w:t>
+              <w:t xml:space="preserve">Identify, record, and review user groups for each report</w:t>
             </w:r>
           </w:p>
         </w:tc>
@@ -10989,7 +10874,7 @@
               <w:cnfStyle w:val="000000000000" w:firstRow="0" w:lastRow="0" w:firstColumn="0" w:lastColumn="0" w:oddVBand="0" w:evenVBand="0" w:oddHBand="0" w:evenHBand="0" w:firstRowFirstColumn="0" w:firstRowLastColumn="0" w:lastRowFirstColumn="0" w:lastRowLastColumn="0"/>
             </w:pPr>
             <w:r>
-              <w:t xml:space="preserve">MS Teams </w:t>
+              <w:t xml:space="preserve">MS Teams</w:t>
             </w:r>
           </w:p>
           <w:p>
@@ -11009,7 +10894,7 @@
               <w:cnfStyle w:val="000000000000" w:firstRow="0" w:lastRow="0" w:firstColumn="0" w:lastColumn="0" w:oddVBand="0" w:evenVBand="0" w:oddHBand="0" w:evenHBand="0" w:firstRowFirstColumn="0" w:firstRowLastColumn="0" w:lastRowFirstColumn="0" w:lastRowLastColumn="0"/>
             </w:pPr>
             <w:r>
-              <w:t xml:space="preserve">MS Co Pilot </w:t>
+              <w:t xml:space="preserve">MS Co Pilot</w:t>
             </w:r>
           </w:p>
           <w:p>
@@ -11053,7 +10938,7 @@
               <w:t>ETL, visualize data</w:t>
             </w:r>
             <w:r>
-              <w:t xml:space="preserve">  </w:t>
+              <w:t xml:space="preserve"/>
             </w:r>
           </w:p>
         </w:tc>
@@ -11195,7 +11080,7 @@
               <w:cnfStyle w:val="000000000000" w:firstRow="0" w:lastRow="0" w:firstColumn="0" w:lastColumn="0" w:oddVBand="0" w:evenVBand="0" w:oddHBand="0" w:evenHBand="0" w:firstRowFirstColumn="0" w:firstRowLastColumn="0" w:lastRowFirstColumn="0" w:lastRowLastColumn="0"/>
             </w:pPr>
             <w:r>
-              <w:t xml:space="preserve">MS Teams </w:t>
+              <w:t xml:space="preserve">MS Teams</w:t>
             </w:r>
           </w:p>
           <w:p>
@@ -11205,17 +11090,12 @@
               <w:cnfStyle w:val="000000000000" w:firstRow="0" w:lastRow="0" w:firstColumn="0" w:lastColumn="0" w:oddVBand="0" w:evenVBand="0" w:oddHBand="0" w:evenHBand="0" w:firstRowFirstColumn="0" w:firstRowLastColumn="0" w:lastRowFirstColumn="0" w:lastRowLastColumn="0"/>
             </w:pPr>
             <w:r>
-              <w:t xml:space="preserve">BI Backlog </w:t>
+              <w:t xml:space="preserve">BI Backlog</w:t>
             </w:r>
           </w:p>
         </w:tc>
       </w:tr>
     </w:tbl>
-    <w:p>
-      <w:pPr>
-        <w:pStyle w:val="ParagraphSpacer"/>
-      </w:pPr>
-    </w:p>
     <w:p>
       <w:pPr>
         <w:pStyle w:val="BodyText"/>
@@ -11526,11 +11406,6 @@
     </w:p>
     <w:p>
       <w:pPr>
-        <w:pStyle w:val="ParagraphSpacer"/>
-      </w:pPr>
-    </w:p>
-    <w:p>
-      <w:pPr>
         <w:pStyle w:val="Heading2"/>
       </w:pPr>
       <w:bookmarkStart w:id="13" w:name="_Toc228252917"/>
@@ -11694,11 +11569,6 @@
     </w:tbl>
     <w:p>
       <w:pPr>
-        <w:pStyle w:val="ParagraphSpacer"/>
-      </w:pPr>
-    </w:p>
-    <w:p>
-      <w:pPr>
         <w:pStyle w:val="BodyText"/>
         <w:rPr>
           <w:i/>
@@ -11717,7 +11587,7 @@
         <w:rPr>
           <w:iCs/>
         </w:rPr>
-        <w:t xml:space="preserve"> </w:t>
+        <w:t xml:space="preserve"/>
       </w:r>
     </w:p>
     <w:p>
@@ -11766,7 +11636,7 @@
               <w:t>Risk Area</w:t>
             </w:r>
             <w:r>
-              <w:t xml:space="preserve"> </w:t>
+              <w:t xml:space="preserve"/>
             </w:r>
           </w:p>
         </w:tc>
@@ -12258,11 +12128,6 @@
         </w:tc>
       </w:tr>
     </w:tbl>
-    <w:p>
-      <w:pPr>
-        <w:pStyle w:val="ParagraphSpacer"/>
-      </w:pPr>
-    </w:p>
     <w:p>
       <w:pPr>
         <w:pStyle w:val="BodyText"/>
@@ -12602,7 +12467,7 @@
                 <w:b w:val="0"/>
                 <w:bCs/>
               </w:rPr>
-              <w:t xml:space="preserve"> </w:t>
+              <w:t xml:space="preserve"/>
             </w:r>
           </w:p>
           <w:p>
@@ -12799,7 +12664,7 @@
               <w:rPr>
                 <w:rStyle w:val="CharacterBold"/>
               </w:rPr>
-              <w:t xml:space="preserve">Organizational Chart.  </w:t>
+              <w:t xml:space="preserve">Organizational Chart. </w:t>
             </w:r>
             <w:r>
               <w:rPr>
@@ -13071,11 +12936,6 @@
         </w:tc>
       </w:tr>
     </w:tbl>
-    <w:p>
-      <w:pPr>
-        <w:pStyle w:val="ParagraphSpacer"/>
-      </w:pPr>
-    </w:p>
     <w:p>
       <w:pPr>
         <w:pStyle w:val="FigureTitle"/>
@@ -13147,12 +13007,6 @@
         </w:drawing>
       </w:r>
     </w:p>
-    <w:p>
-      <w:pPr>
-        <w:pStyle w:val="ParagraphSpacer"/>
-      </w:pPr>
-      <w:bookmarkStart w:id="17" w:name="_Toc150157226"/>
-    </w:p>
     <w:bookmarkEnd w:id="17"/>
     <w:p>
       <w:pPr>
@@ -13311,7 +13165,7 @@
               <w:t>Task 3:</w:t>
             </w:r>
             <w:r>
-              <w:t xml:space="preserve"> State-level Stakeholder Convenings </w:t>
+              <w:t xml:space="preserve"> State-level Stakeholder Convenings</w:t>
             </w:r>
           </w:p>
         </w:tc>
@@ -13917,11 +13771,6 @@
       <w:r>
         <w:t>Table 2.1.3-1. Approach Summary.</w:t>
       </w:r>
-    </w:p>
-    <w:p>
-      <w:pPr>
-        <w:pStyle w:val="ParagraphSpacer"/>
-      </w:pPr>
     </w:p>
     <w:p>
       <w:pPr>
@@ -14018,11 +13867,6 @@
     </w:p>
     <w:p>
       <w:pPr>
-        <w:pStyle w:val="ParagraphSpacer"/>
-      </w:pPr>
-    </w:p>
-    <w:p>
-      <w:pPr>
         <w:pStyle w:val="BodyText"/>
       </w:pPr>
       <w:r>
@@ -14035,7 +13879,7 @@
         <w:t xml:space="preserve"> </w:t>
       </w:r>
       <w:r>
-        <w:t xml:space="preserve">Deloitte's transition methodology ensures continuity of operations, minimizes risks, and achieves a smooth transfer of responsibilities within the designated timeframe. This process was successfully implemented in projects such as the Wyoming integrated eligibility application and data center transition, Texas Department of Information Resources (DIR) transitions, and California infrastructure migration to cloud operations. These experiences inform our approach, emphasizing rigorous entry and exit criteria for each phase, feedback loops, and constant risk evaluation. </w:t>
+        <w:t xml:space="preserve">Deloitte's transition methodology ensures continuity of operations, minimizes risks, and achieves a smooth transfer of responsibilities within the designated timeframe. This process was successfully implemented in projects such as the Wyoming integrated eligibility application and data center transition, Texas Department of Information Resources (DIR) transitions, and California infrastructure migration to cloud operations. These experiences inform our approach, emphasizing rigorous entry and exit criteria for each phase, feedback loops, and constant risk evaluation.</w:t>
       </w:r>
     </w:p>
     <w:p>
@@ -14411,7 +14255,7 @@
         <w:t>(AQLs)</w:t>
       </w:r>
       <w:r>
-        <w:t xml:space="preserve"> </w:t>
+        <w:t xml:space="preserve"/>
       </w:r>
     </w:p>
     <w:p>
@@ -14592,7 +14436,7 @@
         <w:t xml:space="preserve">Workforce </w:t>
       </w:r>
       <w:r>
-        <w:t xml:space="preserve">Delivering the SOW Tasks and Requirements </w:t>
+        <w:t xml:space="preserve">Delivering the SOW Tasks and Requirements</w:t>
       </w:r>
     </w:p>
     <w:p>
@@ -14685,7 +14529,7 @@
         <w:pStyle w:val="Subheading1"/>
       </w:pPr>
       <w:r>
-        <w:t xml:space="preserve">Resource Management and Staffing Approach </w:t>
+        <w:t xml:space="preserve">Resource Management and Staffing Approach</w:t>
       </w:r>
     </w:p>
     <w:p>
@@ -14724,7 +14568,7 @@
         <w:t>Surge</w:t>
       </w:r>
       <w:r>
-        <w:t xml:space="preserve"> Support </w:t>
+        <w:t xml:space="preserve"> Support</w:t>
       </w:r>
     </w:p>
     <w:p>
@@ -15130,7 +14974,7 @@
               <w:spacing w:after="0"/>
             </w:pPr>
             <w:r>
-              <w:t xml:space="preserve">[Degree, Field] [University Name] </w:t>
+              <w:t xml:space="preserve">[Degree, Field] [University Name]</w:t>
             </w:r>
           </w:p>
         </w:tc>
@@ -15212,7 +15056,7 @@
               <w:spacing w:after="0"/>
             </w:pPr>
             <w:r>
-              <w:t xml:space="preserve">[Degree, Field] [University Name] </w:t>
+              <w:t xml:space="preserve">[Degree, Field] [University Name]</w:t>
             </w:r>
           </w:p>
         </w:tc>
@@ -15464,7 +15308,7 @@
               <w:spacing w:after="0"/>
             </w:pPr>
             <w:r>
-              <w:t xml:space="preserve">[Degree] [University Name] </w:t>
+              <w:t xml:space="preserve">[Degree] [University Name]</w:t>
             </w:r>
           </w:p>
         </w:tc>
@@ -15495,7 +15339,7 @@
         <w:t>Significant Leads</w:t>
       </w:r>
       <w:r>
-        <w:t xml:space="preserve"> and Responsibilities </w:t>
+        <w:t xml:space="preserve"> and Responsibilities</w:t>
       </w:r>
     </w:p>
     <w:p>
@@ -17291,7 +17135,7 @@
             </w:pPr>
             <w:r>
               <w:lastRenderedPageBreak/>
-              <w:t xml:space="preserve">Veteran Benefits Administration / VA Medical Disability Examination (MDE) </w:t>
+              <w:t xml:space="preserve">Veteran Benefits Administration / VA Medical Disability Examination (MDE)</w:t>
             </w:r>
           </w:p>
         </w:tc>
@@ -17626,7 +17470,7 @@
               <w:pStyle w:val="TableRowHeading"/>
             </w:pPr>
             <w:r>
-              <w:t xml:space="preserve">Financial Management Operational Analytics (FMOA) / CCIIO </w:t>
+              <w:t xml:space="preserve">Financial Management Operational Analytics (FMOA) / CCIIO</w:t>
             </w:r>
           </w:p>
         </w:tc>
@@ -17959,7 +17803,7 @@
             </w:pPr>
             <w:r>
               <w:lastRenderedPageBreak/>
-              <w:t xml:space="preserve">Project name / Client </w:t>
+              <w:t xml:space="preserve">Project name / Client</w:t>
             </w:r>
           </w:p>
         </w:tc>
@@ -18355,11 +18199,6 @@
     </w:tbl>
     <w:p>
       <w:pPr>
-        <w:pStyle w:val="ParagraphSpacer"/>
-      </w:pPr>
-    </w:p>
-    <w:p>
-      <w:pPr>
         <w:pStyle w:val="BodyText"/>
       </w:pPr>
       <w:r>
@@ -18367,11 +18206,11 @@
       </w:r>
       <w:proofErr w:type="gramStart"/>
       <w:r>
-        <w:t>%  far</w:t>
+        <w:t>% far</w:t>
       </w:r>
       <w:proofErr w:type="gramEnd"/>
       <w:r>
-        <w:t xml:space="preserve"> outperforming industry baselines. We have deep FFE expertise, including former CCIIO leaders, and work regularly to reconcile enrollment and exchange data across five state-based exchanges. </w:t>
+        <w:t xml:space="preserve"> outperforming industry baselines. We have deep FFE expertise, including former CCIIO leaders, and work regularly to reconcile enrollment and exchange data across five state-based exchanges.</w:t>
       </w:r>
     </w:p>
     <w:p>
@@ -18696,13 +18535,8 @@
         <w:t>Labor Category</w:t>
       </w:r>
       <w:r>
-        <w:t xml:space="preserve">: </w:t>
-      </w:r>
-    </w:p>
-    <w:p>
-      <w:pPr>
-        <w:pStyle w:val="ParagraphSpacer"/>
-      </w:pPr>
+        <w:t xml:space="preserve">:</w:t>
+      </w:r>
     </w:p>
     <w:p>
       <w:pPr>
@@ -19091,46 +18925,22 @@
     </w:p>
     <w:p>
       <w:pPr>
+        <w:pStyle w:val="ResumeHeading"/>
+      </w:pPr>
+      <w:r>
+        <w:t>Employment History</w:t>
+      </w:r>
+    </w:p>
+    <w:p>
+      <w:pPr>
         <w:pStyle w:val="Bulletlevel1"/>
         <w:tabs>
           <w:tab w:val="clear" w:pos="360"/>
         </w:tabs>
       </w:pPr>
-    </w:p>
-    <w:p>
-      <w:pPr>
-        <w:pStyle w:val="Bulletlevel1"/>
-        <w:tabs>
-          <w:tab w:val="clear" w:pos="360"/>
-        </w:tabs>
-      </w:pPr>
-    </w:p>
-    <w:p>
-      <w:pPr>
-        <w:pStyle w:val="ResumeHeading"/>
-      </w:pPr>
-      <w:r>
-        <w:t>Employment History</w:t>
-      </w:r>
-    </w:p>
-    <w:p>
-      <w:pPr>
-        <w:pStyle w:val="Bulletlevel1"/>
-        <w:tabs>
-          <w:tab w:val="clear" w:pos="360"/>
-        </w:tabs>
-      </w:pPr>
       <w:r>
         <w:t>Company, Title, (From – To)</w:t>
       </w:r>
-    </w:p>
-    <w:p>
-      <w:pPr>
-        <w:pStyle w:val="Bulletlevel1"/>
-        <w:tabs>
-          <w:tab w:val="clear" w:pos="360"/>
-        </w:tabs>
-      </w:pPr>
     </w:p>
     <w:p>
       <w:pPr>
@@ -19215,13 +19025,8 @@
         <w:t>Labor Category</w:t>
       </w:r>
       <w:r>
-        <w:t xml:space="preserve">: </w:t>
-      </w:r>
-    </w:p>
-    <w:p>
-      <w:pPr>
-        <w:pStyle w:val="ParagraphSpacer"/>
-      </w:pPr>
+        <w:t xml:space="preserve">:</w:t>
+      </w:r>
     </w:p>
     <w:p>
       <w:pPr>
@@ -19606,46 +19411,22 @@
     </w:p>
     <w:p>
       <w:pPr>
+        <w:pStyle w:val="ResumeHeading"/>
+      </w:pPr>
+      <w:r>
+        <w:t>Employment History</w:t>
+      </w:r>
+    </w:p>
+    <w:p>
+      <w:pPr>
         <w:pStyle w:val="Bulletlevel1"/>
         <w:tabs>
           <w:tab w:val="clear" w:pos="360"/>
         </w:tabs>
       </w:pPr>
-    </w:p>
-    <w:p>
-      <w:pPr>
-        <w:pStyle w:val="Bulletlevel1"/>
-        <w:tabs>
-          <w:tab w:val="clear" w:pos="360"/>
-        </w:tabs>
-      </w:pPr>
-    </w:p>
-    <w:p>
-      <w:pPr>
-        <w:pStyle w:val="ResumeHeading"/>
-      </w:pPr>
-      <w:r>
-        <w:t>Employment History</w:t>
-      </w:r>
-    </w:p>
-    <w:p>
-      <w:pPr>
-        <w:pStyle w:val="Bulletlevel1"/>
-        <w:tabs>
-          <w:tab w:val="clear" w:pos="360"/>
-        </w:tabs>
-      </w:pPr>
       <w:r>
         <w:t>Company, Title, (From – To)</w:t>
       </w:r>
-    </w:p>
-    <w:p>
-      <w:pPr>
-        <w:pStyle w:val="Bulletlevel1"/>
-        <w:tabs>
-          <w:tab w:val="clear" w:pos="360"/>
-        </w:tabs>
-      </w:pPr>
     </w:p>
     <w:p>
       <w:pPr>
@@ -19733,13 +19514,8 @@
         <w:t>Labor Category</w:t>
       </w:r>
       <w:r>
-        <w:t xml:space="preserve">: </w:t>
-      </w:r>
-    </w:p>
-    <w:p>
-      <w:pPr>
-        <w:pStyle w:val="ParagraphSpacer"/>
-      </w:pPr>
+        <w:t xml:space="preserve">:</w:t>
+      </w:r>
     </w:p>
     <w:p>
       <w:pPr>
@@ -20124,46 +19900,22 @@
     </w:p>
     <w:p>
       <w:pPr>
+        <w:pStyle w:val="ResumeHeading"/>
+      </w:pPr>
+      <w:r>
+        <w:t>Employment History</w:t>
+      </w:r>
+    </w:p>
+    <w:p>
+      <w:pPr>
         <w:pStyle w:val="Bulletlevel1"/>
         <w:tabs>
           <w:tab w:val="clear" w:pos="360"/>
         </w:tabs>
       </w:pPr>
-    </w:p>
-    <w:p>
-      <w:pPr>
-        <w:pStyle w:val="Bulletlevel1"/>
-        <w:tabs>
-          <w:tab w:val="clear" w:pos="360"/>
-        </w:tabs>
-      </w:pPr>
-    </w:p>
-    <w:p>
-      <w:pPr>
-        <w:pStyle w:val="ResumeHeading"/>
-      </w:pPr>
-      <w:r>
-        <w:t>Employment History</w:t>
-      </w:r>
-    </w:p>
-    <w:p>
-      <w:pPr>
-        <w:pStyle w:val="Bulletlevel1"/>
-        <w:tabs>
-          <w:tab w:val="clear" w:pos="360"/>
-        </w:tabs>
-      </w:pPr>
       <w:r>
         <w:t>Company, Title, (From – To)</w:t>
       </w:r>
-    </w:p>
-    <w:p>
-      <w:pPr>
-        <w:pStyle w:val="Bulletlevel1"/>
-        <w:tabs>
-          <w:tab w:val="clear" w:pos="360"/>
-        </w:tabs>
-      </w:pPr>
     </w:p>
     <w:p>
       <w:pPr>
@@ -20251,13 +20003,8 @@
         <w:t>Labor Category</w:t>
       </w:r>
       <w:r>
-        <w:t xml:space="preserve">: </w:t>
-      </w:r>
-    </w:p>
-    <w:p>
-      <w:pPr>
-        <w:pStyle w:val="ParagraphSpacer"/>
-      </w:pPr>
+        <w:t xml:space="preserve">:</w:t>
+      </w:r>
     </w:p>
     <w:p>
       <w:pPr>
@@ -20642,46 +20389,22 @@
     </w:p>
     <w:p>
       <w:pPr>
+        <w:pStyle w:val="ResumeHeading"/>
+      </w:pPr>
+      <w:r>
+        <w:t>Employment History</w:t>
+      </w:r>
+    </w:p>
+    <w:p>
+      <w:pPr>
         <w:pStyle w:val="Bulletlevel1"/>
         <w:tabs>
           <w:tab w:val="clear" w:pos="360"/>
         </w:tabs>
       </w:pPr>
-    </w:p>
-    <w:p>
-      <w:pPr>
-        <w:pStyle w:val="Bulletlevel1"/>
-        <w:tabs>
-          <w:tab w:val="clear" w:pos="360"/>
-        </w:tabs>
-      </w:pPr>
-    </w:p>
-    <w:p>
-      <w:pPr>
-        <w:pStyle w:val="ResumeHeading"/>
-      </w:pPr>
-      <w:r>
-        <w:t>Employment History</w:t>
-      </w:r>
-    </w:p>
-    <w:p>
-      <w:pPr>
-        <w:pStyle w:val="Bulletlevel1"/>
-        <w:tabs>
-          <w:tab w:val="clear" w:pos="360"/>
-        </w:tabs>
-      </w:pPr>
       <w:r>
         <w:t>Company, Title, (From – To)</w:t>
       </w:r>
-    </w:p>
-    <w:p>
-      <w:pPr>
-        <w:pStyle w:val="Bulletlevel1"/>
-        <w:tabs>
-          <w:tab w:val="clear" w:pos="360"/>
-        </w:tabs>
-      </w:pPr>
     </w:p>
     <w:p>
       <w:pPr>
@@ -20766,13 +20489,8 @@
         <w:t>Labor Category</w:t>
       </w:r>
       <w:r>
-        <w:t xml:space="preserve">: </w:t>
-      </w:r>
-    </w:p>
-    <w:p>
-      <w:pPr>
-        <w:pStyle w:val="ParagraphSpacer"/>
-      </w:pPr>
+        <w:t xml:space="preserve">:</w:t>
+      </w:r>
     </w:p>
     <w:p>
       <w:pPr>
@@ -21157,46 +20875,22 @@
     </w:p>
     <w:p>
       <w:pPr>
+        <w:pStyle w:val="ResumeHeading"/>
+      </w:pPr>
+      <w:r>
+        <w:t>Employment History</w:t>
+      </w:r>
+    </w:p>
+    <w:p>
+      <w:pPr>
         <w:pStyle w:val="Bulletlevel1"/>
         <w:tabs>
           <w:tab w:val="clear" w:pos="360"/>
         </w:tabs>
       </w:pPr>
-    </w:p>
-    <w:p>
-      <w:pPr>
-        <w:pStyle w:val="Bulletlevel1"/>
-        <w:tabs>
-          <w:tab w:val="clear" w:pos="360"/>
-        </w:tabs>
-      </w:pPr>
-    </w:p>
-    <w:p>
-      <w:pPr>
-        <w:pStyle w:val="ResumeHeading"/>
-      </w:pPr>
-      <w:r>
-        <w:t>Employment History</w:t>
-      </w:r>
-    </w:p>
-    <w:p>
-      <w:pPr>
-        <w:pStyle w:val="Bulletlevel1"/>
-        <w:tabs>
-          <w:tab w:val="clear" w:pos="360"/>
-        </w:tabs>
-      </w:pPr>
       <w:r>
         <w:t>Company, Title, (From – To)</w:t>
       </w:r>
-    </w:p>
-    <w:p>
-      <w:pPr>
-        <w:pStyle w:val="Bulletlevel1"/>
-        <w:tabs>
-          <w:tab w:val="clear" w:pos="360"/>
-        </w:tabs>
-      </w:pPr>
     </w:p>
     <w:p>
       <w:pPr>
@@ -21286,13 +20980,8 @@
         <w:t>Labor Category</w:t>
       </w:r>
       <w:r>
-        <w:t xml:space="preserve">: </w:t>
-      </w:r>
-    </w:p>
-    <w:p>
-      <w:pPr>
-        <w:pStyle w:val="ParagraphSpacer"/>
-      </w:pPr>
+        <w:t xml:space="preserve">:</w:t>
+      </w:r>
     </w:p>
     <w:p>
       <w:pPr>
@@ -21677,46 +21366,22 @@
     </w:p>
     <w:p>
       <w:pPr>
+        <w:pStyle w:val="ResumeHeading"/>
+      </w:pPr>
+      <w:r>
+        <w:t>Employment History</w:t>
+      </w:r>
+    </w:p>
+    <w:p>
+      <w:pPr>
         <w:pStyle w:val="Bulletlevel1"/>
         <w:tabs>
           <w:tab w:val="clear" w:pos="360"/>
         </w:tabs>
       </w:pPr>
-    </w:p>
-    <w:p>
-      <w:pPr>
-        <w:pStyle w:val="Bulletlevel1"/>
-        <w:tabs>
-          <w:tab w:val="clear" w:pos="360"/>
-        </w:tabs>
-      </w:pPr>
-    </w:p>
-    <w:p>
-      <w:pPr>
-        <w:pStyle w:val="ResumeHeading"/>
-      </w:pPr>
-      <w:r>
-        <w:t>Employment History</w:t>
-      </w:r>
-    </w:p>
-    <w:p>
-      <w:pPr>
-        <w:pStyle w:val="Bulletlevel1"/>
-        <w:tabs>
-          <w:tab w:val="clear" w:pos="360"/>
-        </w:tabs>
-      </w:pPr>
       <w:r>
         <w:t>Company, Title, (From – To)</w:t>
       </w:r>
-    </w:p>
-    <w:p>
-      <w:pPr>
-        <w:pStyle w:val="Bulletlevel1"/>
-        <w:tabs>
-          <w:tab w:val="clear" w:pos="360"/>
-        </w:tabs>
-      </w:pPr>
     </w:p>
     <w:p>
       <w:pPr>
@@ -21855,7 +21520,7 @@
               <w:t>2</w:t>
             </w:r>
             <w:r>
-              <w:t xml:space="preserve"> Bullet2 </w:t>
+              <w:t xml:space="preserve"> Bullet2</w:t>
             </w:r>
           </w:p>
         </w:tc>
@@ -22723,11 +22388,6 @@
     </w:p>
     <w:p>
       <w:pPr>
-        <w:pStyle w:val="ParagraphSpacer"/>
-      </w:pPr>
-    </w:p>
-    <w:p>
-      <w:pPr>
         <w:pStyle w:val="ResumeHeading"/>
       </w:pPr>
       <w:r>
@@ -23109,46 +22769,22 @@
     </w:p>
     <w:p>
       <w:pPr>
+        <w:pStyle w:val="ResumeHeading"/>
+      </w:pPr>
+      <w:r>
+        <w:t>Employment History</w:t>
+      </w:r>
+    </w:p>
+    <w:p>
+      <w:pPr>
         <w:pStyle w:val="Bulletlevel1"/>
         <w:tabs>
           <w:tab w:val="clear" w:pos="360"/>
         </w:tabs>
       </w:pPr>
-    </w:p>
-    <w:p>
-      <w:pPr>
-        <w:pStyle w:val="Bulletlevel1"/>
-        <w:tabs>
-          <w:tab w:val="clear" w:pos="360"/>
-        </w:tabs>
-      </w:pPr>
-    </w:p>
-    <w:p>
-      <w:pPr>
-        <w:pStyle w:val="ResumeHeading"/>
-      </w:pPr>
-      <w:r>
-        <w:t>Employment History</w:t>
-      </w:r>
-    </w:p>
-    <w:p>
-      <w:pPr>
-        <w:pStyle w:val="Bulletlevel1"/>
-        <w:tabs>
-          <w:tab w:val="clear" w:pos="360"/>
-        </w:tabs>
-      </w:pPr>
       <w:r>
         <w:t>Company, Title, (From – To)</w:t>
       </w:r>
-    </w:p>
-    <w:p>
-      <w:pPr>
-        <w:pStyle w:val="Bulletlevel1"/>
-        <w:tabs>
-          <w:tab w:val="clear" w:pos="360"/>
-        </w:tabs>
-      </w:pPr>
     </w:p>
     <w:p>
       <w:pPr>
@@ -23472,7 +23108,7 @@
               <w:t>Client Point of Contact:</w:t>
             </w:r>
             <w:r>
-              <w:t xml:space="preserve"> </w:t>
+              <w:t xml:space="preserve"/>
             </w:r>
           </w:p>
         </w:tc>
@@ -23500,15 +23136,10 @@
     </w:tbl>
     <w:p>
       <w:pPr>
-        <w:pStyle w:val="PastPerfTableHeadingLeft"/>
-      </w:pPr>
-    </w:p>
-    <w:p>
-      <w:pPr>
         <w:pStyle w:val="Note1"/>
       </w:pPr>
       <w:r>
-        <w:t xml:space="preserve">Relevance to Agency Name: </w:t>
+        <w:t xml:space="preserve">Relevance to Agency Name:</w:t>
       </w:r>
     </w:p>
     <w:p>
@@ -23571,7 +23202,7 @@
       </w:r>
       <w:proofErr w:type="gramEnd"/>
       <w:r>
-        <w:t xml:space="preserve"> an IDIQ contract. </w:t>
+        <w:t xml:space="preserve"> an IDIQ contract.</w:t>
       </w:r>
     </w:p>
     <w:p>
@@ -23626,7 +23257,7 @@
         <w:pStyle w:val="Note1"/>
       </w:pPr>
       <w:r>
-        <w:t xml:space="preserve">Narrative: </w:t>
+        <w:t xml:space="preserve">Narrative:</w:t>
       </w:r>
     </w:p>
     <w:p>
@@ -23681,7 +23312,7 @@
       </w:pPr>
       <w:r>
         <w:lastRenderedPageBreak/>
-        <w:t xml:space="preserve">Establishing a program governance process and developing a program management office to coordinate this large-scale Oracle roll-out. </w:t>
+        <w:t xml:space="preserve">Establishing a program governance process and developing a program management office to coordinate this large-scale Oracle roll-out.</w:t>
       </w:r>
     </w:p>
     <w:p>
@@ -23695,7 +23326,7 @@
         <w:t>Developing and deploying the Oracle-based system at client locations, including replacing and</w:t>
       </w:r>
       <w:r>
-        <w:t xml:space="preserve"> retiring legacy financial systems. </w:t>
+        <w:t xml:space="preserve"> retiring legacy financial systems.</w:t>
       </w:r>
     </w:p>
     <w:p>
@@ -23711,7 +23342,7 @@
       </w:r>
       <w:proofErr w:type="gramEnd"/>
       <w:r>
-        <w:t xml:space="preserve"> Agency Name Task Order Name requirements. This $15 million, multi-year project covers both agency and enterprise-wide technology and management issues. </w:t>
+        <w:t xml:space="preserve"> Agency Name Task Order Name requirements. This $15 million, multi-year project covers both agency and enterprise-wide technology and management issues.</w:t>
       </w:r>
     </w:p>
     <w:p>
@@ -23744,7 +23375,7 @@
         </w:tabs>
       </w:pPr>
       <w:r>
-        <w:t xml:space="preserve">Bullet 1 text. </w:t>
+        <w:t xml:space="preserve">Bullet 1 text.</w:t>
       </w:r>
     </w:p>
     <w:p>
@@ -23766,7 +23397,7 @@
         </w:tabs>
       </w:pPr>
       <w:r>
-        <w:t xml:space="preserve">Etc. </w:t>
+        <w:t xml:space="preserve">Etc.</w:t>
       </w:r>
     </w:p>
     <w:p>
@@ -23774,7 +23405,7 @@
         <w:pStyle w:val="Note1"/>
       </w:pPr>
       <w:r>
-        <w:t xml:space="preserve">Solution Benefits: </w:t>
+        <w:t xml:space="preserve">Solution Benefits:</w:t>
       </w:r>
     </w:p>
     <w:p>
@@ -23828,7 +23459,7 @@
         </w:tabs>
       </w:pPr>
       <w:r>
-        <w:t xml:space="preserve">Implementing a centralized financial platform, which increases compliance with federal accounting standards and management process improvement initiatives. </w:t>
+        <w:t xml:space="preserve">Implementing a centralized financial platform, which increases compliance with federal accounting standards and management process improvement initiatives.</w:t>
       </w:r>
     </w:p>
     <w:p>
@@ -23839,7 +23470,7 @@
         </w:tabs>
       </w:pPr>
       <w:r>
-        <w:t xml:space="preserve">Streamlining of operations, resulting in a 30-percent increase in productivity and savings of $4.6 million. </w:t>
+        <w:t xml:space="preserve">Streamlining of operations, resulting in a 30-percent increase in productivity and savings of $4.6 million.</w:t>
       </w:r>
     </w:p>
     <w:p>
@@ -23850,7 +23481,7 @@
         </w:tabs>
       </w:pPr>
       <w:r>
-        <w:t xml:space="preserve">Enhancing ability to obtain enterprise-wide financial information. </w:t>
+        <w:t xml:space="preserve">Enhancing ability to obtain enterprise-wide financial information.</w:t>
       </w:r>
     </w:p>
     <w:p>
@@ -23864,7 +23495,7 @@
         <w:t>Retirement of more than 45 applications, saving the client over $7 million in maintenan</w:t>
       </w:r>
       <w:r>
-        <w:t xml:space="preserve">ce, upgrades, and licenses associated with legacy systems. </w:t>
+        <w:t xml:space="preserve">ce, upgrades, and licenses associated with legacy systems.</w:t>
       </w:r>
     </w:p>
     <w:p>
@@ -23872,7 +23503,7 @@
         <w:pStyle w:val="Note1"/>
       </w:pPr>
       <w:r>
-        <w:t xml:space="preserve">Quality of Work Performed: </w:t>
+        <w:t xml:space="preserve">Quality of Work Performed:</w:t>
       </w:r>
     </w:p>
     <w:p>
@@ -23910,7 +23541,7 @@
         <w:t xml:space="preserve">(Example A) Deloitte delivered significant value to the client throughout the project, as </w:t>
       </w:r>
       <w:r>
-        <w:t xml:space="preserve">noted above. The client awarded Deloitte additional work: PMO and OCM support were extended from April 1 to September 30, 2006. </w:t>
+        <w:t xml:space="preserve">noted above. The client awarded Deloitte additional work: PMO and OCM support were extended from April 1 to September 30, 2006.</w:t>
       </w:r>
     </w:p>
     <w:p>
@@ -23959,7 +23590,7 @@
       </w:r>
       <w:r>
         <w:tab/>
-        <w:t xml:space="preserve">—First and Last Name of Individual, Job Title, Agency Name </w:t>
+        <w:t xml:space="preserve">—First and Last Name of Individual, Job Title, Agency Name</w:t>
       </w:r>
     </w:p>
     <w:p>
@@ -23983,7 +23614,7 @@
         <w:pStyle w:val="Note1"/>
       </w:pPr>
       <w:r>
-        <w:t xml:space="preserve">Number, type, and severity of any quality, delivery, or cost problems in performing the contract, the corrective action taken, and the effectiveness of the corrective action: </w:t>
+        <w:t xml:space="preserve">Number, type, and severity of any quality, delivery, or cost problems in performing the contract, the corrective action taken, and the effectiveness of the corrective action:</w:t>
       </w:r>
     </w:p>
     <w:p>
@@ -24303,7 +23934,7 @@
               <w:t>Client Point of Contact:</w:t>
             </w:r>
             <w:r>
-              <w:t xml:space="preserve"> </w:t>
+              <w:t xml:space="preserve"/>
             </w:r>
           </w:p>
         </w:tc>
@@ -24329,11 +23960,6 @@
         </w:tc>
       </w:tr>
     </w:tbl>
-    <w:p>
-      <w:pPr>
-        <w:pStyle w:val="ParagraphSpacer"/>
-      </w:pPr>
-    </w:p>
     <w:tbl>
       <w:tblPr>
         <w:tblW w:w="0" w:type="auto"/>

</xml_diff>